<commit_message>
Added sol for P07
</commit_message>
<xml_diff>
--- a/P06-mlflow/SCSE3040_P06_S24CSEU2214.docx
+++ b/P06-mlflow/SCSE3040_P06_S24CSEU2214.docx
@@ -2,7 +2,672 @@
 <file path=word/document.xml><?xml version="1.0" encoding="utf-8"?>
 <w:document xmlns:wpc="http://schemas.microsoft.com/office/word/2010/wordprocessingCanvas" xmlns:cx="http://schemas.microsoft.com/office/drawing/2014/chartex" xmlns:cx1="http://schemas.microsoft.com/office/drawing/2015/9/8/chartex" xmlns:cx2="http://schemas.microsoft.com/office/drawing/2015/10/21/chartex" xmlns:cx3="http://schemas.microsoft.com/office/drawing/2016/5/9/chartex" xmlns:cx4="http://schemas.microsoft.com/office/drawing/2016/5/10/chartex" xmlns:cx5="http://schemas.microsoft.com/office/drawing/2016/5/11/chartex" xmlns:cx6="http://schemas.microsoft.com/office/drawing/2016/5/12/chartex" xmlns:cx7="http://schemas.microsoft.com/office/drawing/2016/5/13/chartex" xmlns:cx8="http://schemas.microsoft.com/office/drawing/2016/5/14/chartex" xmlns:mc="http://schemas.openxmlformats.org/markup-compatibility/2006" xmlns:m="http://schemas.openxmlformats.org/officeDocument/2006/math" xmlns:aink="http://schemas.microsoft.com/office/drawing/2016/ink" xmlns:am3d="http://schemas.microsoft.com/office/drawing/2017/model3d" xmlns:oel="http://schemas.microsoft.com/office/2019/extlst" xmlns:r="http://schemas.openxmlformats.org/officeDocument/2006/relationships" xmlns:wp14="http://schemas.microsoft.com/office/word/2010/wordprocessingDrawing" xmlns:wp="http://schemas.openxmlformats.org/drawingml/2006/wordprocessingDrawing" xmlns:wpg="http://schemas.microsoft.com/office/word/2010/wordprocessingGroup" xmlns:wpi="http://schemas.microsoft.com/office/word/2010/wordprocessingInk" xmlns:wps="http://schemas.microsoft.com/office/word/2010/wordprocessingShape" xmlns:o="urn:schemas-microsoft-com:office:office" xmlns:v="urn:schemas-microsoft-com:vml" xmlns:w10="urn:schemas-microsoft-com:office:word" xmlns:w="http://schemas.openxmlformats.org/wordprocessingml/2006/main" xmlns:w14="http://schemas.microsoft.com/office/word/2010/wordml" xmlns:w15="http://schemas.microsoft.com/office/word/2012/wordml" xmlns:w16cex="http://schemas.microsoft.com/office/word/2018/wordml/cex" xmlns:w16cid="http://schemas.microsoft.com/office/word/2016/wordml/cid" xmlns:w16="http://schemas.microsoft.com/office/word/2018/wordml" xmlns:w16sdtdh="http://schemas.microsoft.com/office/word/2020/wordml/sdtdatahash" xmlns:w16sdtfl="http://schemas.microsoft.com/office/word/2024/wordml/sdtformatlock" xmlns:w16se="http://schemas.microsoft.com/office/word/2015/wordml/symex" xmlns:w16du="http://schemas.microsoft.com/office/word/2023/wordml/word16du" xmlns:wne="http://schemas.microsoft.com/office/word/2006/wordml" mc:Ignorable="w14 w15 w16se w16cid w16 w16cex w16sdtdh w16sdtfl w16du wp14">
   <w:body>
-    <w:p/>
+    <w:p>
+      <w:pPr>
+        <w:rPr>
+          <w:rFonts w:ascii="SF Pro" w:hAnsi="SF Pro"/>
+          <w:sz w:val="30"/>
+          <w:szCs w:val="30"/>
+          <w:lang w:val="en-US"/>
+        </w:rPr>
+      </w:pPr>
+      <w:r>
+        <w:rPr>
+          <w:rFonts w:ascii="SF Pro" w:hAnsi="SF Pro"/>
+          <w:sz w:val="30"/>
+          <w:szCs w:val="30"/>
+          <w:lang w:val="en-US"/>
+        </w:rPr>
+        <w:t>Swapnil Pramanik, S24CSEU2214, Batch – 84</w:t>
+      </w:r>
+    </w:p>
+    <w:p>
+      <w:pPr>
+        <w:rPr>
+          <w:rFonts w:ascii="SF Pro" w:hAnsi="SF Pro"/>
+          <w:sz w:val="30"/>
+          <w:szCs w:val="30"/>
+          <w:lang w:val="en-US"/>
+        </w:rPr>
+      </w:pPr>
+      <w:r>
+        <w:rPr>
+          <w:rFonts w:ascii="SF Pro" w:hAnsi="SF Pro"/>
+          <w:sz w:val="30"/>
+          <w:szCs w:val="30"/>
+          <w:lang w:val="en-US"/>
+        </w:rPr>
+        <w:t>Date – 2</w:t>
+      </w:r>
+      <w:r>
+        <w:rPr>
+          <w:rFonts w:ascii="SF Pro" w:hAnsi="SF Pro"/>
+          <w:sz w:val="30"/>
+          <w:szCs w:val="30"/>
+          <w:vertAlign w:val="superscript"/>
+          <w:lang w:val="en-US"/>
+        </w:rPr>
+        <w:t xml:space="preserve">nd </w:t>
+      </w:r>
+      <w:r>
+        <w:rPr>
+          <w:rFonts w:ascii="SF Pro" w:hAnsi="SF Pro"/>
+          <w:sz w:val="30"/>
+          <w:szCs w:val="30"/>
+          <w:lang w:val="en-US"/>
+        </w:rPr>
+        <w:t>October 2026</w:t>
+      </w:r>
+    </w:p>
+    <w:p>
+      <w:pPr>
+        <w:rPr>
+          <w:rFonts w:ascii="SF Pro" w:hAnsi="SF Pro"/>
+          <w:lang w:val="en-US"/>
+        </w:rPr>
+      </w:pPr>
+      <w:r>
+        <w:rPr>
+          <w:rFonts w:ascii="SF Pro" w:hAnsi="SF Pro"/>
+          <w:b/>
+          <w:bCs/>
+          <w:lang w:val="en-US"/>
+        </w:rPr>
+        <w:t xml:space="preserve">Assignment solution link - </w:t>
+      </w:r>
+      <w:hyperlink r:id="rId4" w:history="1">
+        <w:r>
+          <w:rPr>
+            <w:rStyle w:val="Hyperlink"/>
+            <w:rFonts w:ascii="SF Pro" w:hAnsi="SF Pro"/>
+            <w:lang w:val="en-US"/>
+          </w:rPr>
+          <w:t>https://github.com/Swapnil-Pramanik/SCSE3040-Lab/tree/main/P06-mlflow</w:t>
+        </w:r>
+      </w:hyperlink>
+    </w:p>
+    <w:p>
+      <w:pPr>
+        <w:rPr>
+          <w:rFonts w:ascii="SF Pro" w:hAnsi="SF Pro"/>
+          <w:lang w:val="en-US"/>
+        </w:rPr>
+      </w:pPr>
+      <w:r>
+        <w:rPr>
+          <w:rFonts w:ascii="SF Pro" w:hAnsi="SF Pro"/>
+          <w:b/>
+          <w:bCs/>
+          <w:lang w:val="en-US"/>
+        </w:rPr>
+        <w:t xml:space="preserve">MLFlow UI </w:t>
+      </w:r>
+      <w:r>
+        <w:rPr>
+          <w:rFonts w:ascii="SF Pro" w:hAnsi="SF Pro"/>
+          <w:b/>
+          <w:bCs/>
+          <w:lang w:val="en-US"/>
+        </w:rPr>
+        <w:t>–</w:t>
+      </w:r>
+      <w:r>
+        <w:rPr>
+          <w:rFonts w:ascii="SF Pro" w:hAnsi="SF Pro"/>
+          <w:b/>
+          <w:bCs/>
+          <w:lang w:val="en-US"/>
+        </w:rPr>
+        <w:t xml:space="preserve"> </w:t>
+      </w:r>
+    </w:p>
+    <w:p>
+      <w:pPr>
+        <w:rPr>
+          <w:rFonts w:ascii="SF Pro" w:hAnsi="SF Pro"/>
+          <w:lang w:val="en-US"/>
+        </w:rPr>
+      </w:pPr>
+      <w:r>
+        <w:rPr>
+          <w:rFonts w:ascii="SF Pro" w:hAnsi="SF Pro"/>
+          <w:noProof/>
+          <w:lang w:val="en-US"/>
+        </w:rPr>
+        <w:drawing>
+          <wp:anchor distT="0" distB="0" distL="114300" distR="114300" simplePos="0" relativeHeight="251659264" behindDoc="0" locked="0" layoutInCell="1" allowOverlap="1" wp14:anchorId="7ED1CD14" wp14:editId="0B8CEA43">
+            <wp:simplePos x="0" y="0"/>
+            <wp:positionH relativeFrom="column">
+              <wp:posOffset>0</wp:posOffset>
+            </wp:positionH>
+            <wp:positionV relativeFrom="paragraph">
+              <wp:posOffset>1217776</wp:posOffset>
+            </wp:positionV>
+            <wp:extent cx="5731510" cy="381635"/>
+            <wp:effectExtent l="0" t="0" r="0" b="0"/>
+            <wp:wrapTopAndBottom/>
+            <wp:docPr id="522646988" name="Picture 2"/>
+            <wp:cNvGraphicFramePr>
+              <a:graphicFrameLocks xmlns:a="http://schemas.openxmlformats.org/drawingml/2006/main" noChangeAspect="1"/>
+            </wp:cNvGraphicFramePr>
+            <a:graphic xmlns:a="http://schemas.openxmlformats.org/drawingml/2006/main">
+              <a:graphicData uri="http://schemas.openxmlformats.org/drawingml/2006/picture">
+                <pic:pic xmlns:pic="http://schemas.openxmlformats.org/drawingml/2006/picture">
+                  <pic:nvPicPr>
+                    <pic:cNvPr id="522646988" name="Picture 522646988"/>
+                    <pic:cNvPicPr/>
+                  </pic:nvPicPr>
+                  <pic:blipFill>
+                    <a:blip r:embed="rId5" cstate="print">
+                      <a:extLst>
+                        <a:ext uri="{28A0092B-C50C-407E-A947-70E740481C1C}">
+                          <a14:useLocalDpi xmlns:a14="http://schemas.microsoft.com/office/drawing/2010/main" val="0"/>
+                        </a:ext>
+                      </a:extLst>
+                    </a:blip>
+                    <a:stretch>
+                      <a:fillRect/>
+                    </a:stretch>
+                  </pic:blipFill>
+                  <pic:spPr>
+                    <a:xfrm>
+                      <a:off x="0" y="0"/>
+                      <a:ext cx="5731510" cy="381635"/>
+                    </a:xfrm>
+                    <a:prstGeom prst="rect">
+                      <a:avLst/>
+                    </a:prstGeom>
+                  </pic:spPr>
+                </pic:pic>
+              </a:graphicData>
+            </a:graphic>
+            <wp14:sizeRelH relativeFrom="page">
+              <wp14:pctWidth>0</wp14:pctWidth>
+            </wp14:sizeRelH>
+            <wp14:sizeRelV relativeFrom="page">
+              <wp14:pctHeight>0</wp14:pctHeight>
+            </wp14:sizeRelV>
+          </wp:anchor>
+        </w:drawing>
+      </w:r>
+      <w:r>
+        <w:rPr>
+          <w:rFonts w:ascii="SF Pro" w:hAnsi="SF Pro"/>
+          <w:noProof/>
+          <w:lang w:val="en-US"/>
+        </w:rPr>
+        <w:drawing>
+          <wp:anchor distT="0" distB="0" distL="114300" distR="114300" simplePos="0" relativeHeight="251658240" behindDoc="0" locked="0" layoutInCell="1" allowOverlap="1" wp14:anchorId="2EEA1760" wp14:editId="11624D5B">
+            <wp:simplePos x="0" y="0"/>
+            <wp:positionH relativeFrom="column">
+              <wp:posOffset>0</wp:posOffset>
+            </wp:positionH>
+            <wp:positionV relativeFrom="paragraph">
+              <wp:posOffset>2540</wp:posOffset>
+            </wp:positionV>
+            <wp:extent cx="5731510" cy="1002030"/>
+            <wp:effectExtent l="0" t="0" r="0" b="1270"/>
+            <wp:wrapTopAndBottom/>
+            <wp:docPr id="860054363" name="Picture 1"/>
+            <wp:cNvGraphicFramePr>
+              <a:graphicFrameLocks xmlns:a="http://schemas.openxmlformats.org/drawingml/2006/main" noChangeAspect="1"/>
+            </wp:cNvGraphicFramePr>
+            <a:graphic xmlns:a="http://schemas.openxmlformats.org/drawingml/2006/main">
+              <a:graphicData uri="http://schemas.openxmlformats.org/drawingml/2006/picture">
+                <pic:pic xmlns:pic="http://schemas.openxmlformats.org/drawingml/2006/picture">
+                  <pic:nvPicPr>
+                    <pic:cNvPr id="860054363" name="Picture 860054363"/>
+                    <pic:cNvPicPr/>
+                  </pic:nvPicPr>
+                  <pic:blipFill>
+                    <a:blip r:embed="rId6" cstate="print">
+                      <a:extLst>
+                        <a:ext uri="{28A0092B-C50C-407E-A947-70E740481C1C}">
+                          <a14:useLocalDpi xmlns:a14="http://schemas.microsoft.com/office/drawing/2010/main" val="0"/>
+                        </a:ext>
+                      </a:extLst>
+                    </a:blip>
+                    <a:stretch>
+                      <a:fillRect/>
+                    </a:stretch>
+                  </pic:blipFill>
+                  <pic:spPr>
+                    <a:xfrm>
+                      <a:off x="0" y="0"/>
+                      <a:ext cx="5731510" cy="1002030"/>
+                    </a:xfrm>
+                    <a:prstGeom prst="rect">
+                      <a:avLst/>
+                    </a:prstGeom>
+                  </pic:spPr>
+                </pic:pic>
+              </a:graphicData>
+            </a:graphic>
+            <wp14:sizeRelH relativeFrom="page">
+              <wp14:pctWidth>0</wp14:pctWidth>
+            </wp14:sizeRelH>
+            <wp14:sizeRelV relativeFrom="page">
+              <wp14:pctHeight>0</wp14:pctHeight>
+            </wp14:sizeRelV>
+          </wp:anchor>
+        </w:drawing>
+      </w:r>
+      <w:r>
+        <w:rPr>
+          <w:rFonts w:ascii="SF Pro" w:hAnsi="SF Pro"/>
+          <w:lang w:val="en-US"/>
+        </w:rPr>
+        <w:t>linear-baseline –</w:t>
+      </w:r>
+    </w:p>
+    <w:p>
+      <w:pPr>
+        <w:rPr>
+          <w:rFonts w:ascii="SF Pro" w:hAnsi="SF Pro"/>
+          <w:lang w:val="en-US"/>
+        </w:rPr>
+      </w:pPr>
+      <w:r>
+        <w:rPr>
+          <w:rFonts w:ascii="SF Pro" w:hAnsi="SF Pro"/>
+          <w:noProof/>
+          <w:lang w:val="en-US"/>
+        </w:rPr>
+        <w:drawing>
+          <wp:anchor distT="0" distB="0" distL="114300" distR="114300" simplePos="0" relativeHeight="251660288" behindDoc="0" locked="0" layoutInCell="1" allowOverlap="1" wp14:anchorId="76CD09C0" wp14:editId="2CE0946E">
+            <wp:simplePos x="0" y="0"/>
+            <wp:positionH relativeFrom="column">
+              <wp:posOffset>0</wp:posOffset>
+            </wp:positionH>
+            <wp:positionV relativeFrom="paragraph">
+              <wp:posOffset>483193</wp:posOffset>
+            </wp:positionV>
+            <wp:extent cx="5731510" cy="404495"/>
+            <wp:effectExtent l="0" t="0" r="0" b="1905"/>
+            <wp:wrapTopAndBottom/>
+            <wp:docPr id="530374465" name="Picture 3"/>
+            <wp:cNvGraphicFramePr>
+              <a:graphicFrameLocks xmlns:a="http://schemas.openxmlformats.org/drawingml/2006/main" noChangeAspect="1"/>
+            </wp:cNvGraphicFramePr>
+            <a:graphic xmlns:a="http://schemas.openxmlformats.org/drawingml/2006/main">
+              <a:graphicData uri="http://schemas.openxmlformats.org/drawingml/2006/picture">
+                <pic:pic xmlns:pic="http://schemas.openxmlformats.org/drawingml/2006/picture">
+                  <pic:nvPicPr>
+                    <pic:cNvPr id="530374465" name="Picture 530374465"/>
+                    <pic:cNvPicPr/>
+                  </pic:nvPicPr>
+                  <pic:blipFill>
+                    <a:blip r:embed="rId7" cstate="print">
+                      <a:extLst>
+                        <a:ext uri="{28A0092B-C50C-407E-A947-70E740481C1C}">
+                          <a14:useLocalDpi xmlns:a14="http://schemas.microsoft.com/office/drawing/2010/main" val="0"/>
+                        </a:ext>
+                      </a:extLst>
+                    </a:blip>
+                    <a:stretch>
+                      <a:fillRect/>
+                    </a:stretch>
+                  </pic:blipFill>
+                  <pic:spPr>
+                    <a:xfrm>
+                      <a:off x="0" y="0"/>
+                      <a:ext cx="5731510" cy="404495"/>
+                    </a:xfrm>
+                    <a:prstGeom prst="rect">
+                      <a:avLst/>
+                    </a:prstGeom>
+                  </pic:spPr>
+                </pic:pic>
+              </a:graphicData>
+            </a:graphic>
+            <wp14:sizeRelH relativeFrom="page">
+              <wp14:pctWidth>0</wp14:pctWidth>
+            </wp14:sizeRelH>
+            <wp14:sizeRelV relativeFrom="page">
+              <wp14:pctHeight>0</wp14:pctHeight>
+            </wp14:sizeRelV>
+          </wp:anchor>
+        </w:drawing>
+      </w:r>
+      <w:r>
+        <w:rPr>
+          <w:rFonts w:ascii="SF Pro" w:hAnsi="SF Pro"/>
+          <w:lang w:val="en-US"/>
+        </w:rPr>
+        <w:t>tree-d2 –</w:t>
+      </w:r>
+    </w:p>
+    <w:p>
+      <w:pPr>
+        <w:rPr>
+          <w:rFonts w:ascii="SF Pro" w:hAnsi="SF Pro"/>
+          <w:lang w:val="en-US"/>
+        </w:rPr>
+      </w:pPr>
+      <w:r>
+        <w:rPr>
+          <w:rFonts w:ascii="SF Pro" w:hAnsi="SF Pro"/>
+          <w:noProof/>
+          <w:lang w:val="en-US"/>
+        </w:rPr>
+        <w:drawing>
+          <wp:anchor distT="0" distB="0" distL="114300" distR="114300" simplePos="0" relativeHeight="251662336" behindDoc="0" locked="0" layoutInCell="1" allowOverlap="1" wp14:anchorId="762802ED" wp14:editId="0E09CADC">
+            <wp:simplePos x="0" y="0"/>
+            <wp:positionH relativeFrom="column">
+              <wp:posOffset>0</wp:posOffset>
+            </wp:positionH>
+            <wp:positionV relativeFrom="paragraph">
+              <wp:posOffset>1125220</wp:posOffset>
+            </wp:positionV>
+            <wp:extent cx="5731510" cy="384175"/>
+            <wp:effectExtent l="0" t="0" r="0" b="0"/>
+            <wp:wrapTopAndBottom/>
+            <wp:docPr id="239490881" name="Picture 5"/>
+            <wp:cNvGraphicFramePr>
+              <a:graphicFrameLocks xmlns:a="http://schemas.openxmlformats.org/drawingml/2006/main" noChangeAspect="1"/>
+            </wp:cNvGraphicFramePr>
+            <a:graphic xmlns:a="http://schemas.openxmlformats.org/drawingml/2006/main">
+              <a:graphicData uri="http://schemas.openxmlformats.org/drawingml/2006/picture">
+                <pic:pic xmlns:pic="http://schemas.openxmlformats.org/drawingml/2006/picture">
+                  <pic:nvPicPr>
+                    <pic:cNvPr id="239490881" name="Picture 239490881"/>
+                    <pic:cNvPicPr/>
+                  </pic:nvPicPr>
+                  <pic:blipFill>
+                    <a:blip r:embed="rId8" cstate="print">
+                      <a:extLst>
+                        <a:ext uri="{28A0092B-C50C-407E-A947-70E740481C1C}">
+                          <a14:useLocalDpi xmlns:a14="http://schemas.microsoft.com/office/drawing/2010/main" val="0"/>
+                        </a:ext>
+                      </a:extLst>
+                    </a:blip>
+                    <a:stretch>
+                      <a:fillRect/>
+                    </a:stretch>
+                  </pic:blipFill>
+                  <pic:spPr>
+                    <a:xfrm>
+                      <a:off x="0" y="0"/>
+                      <a:ext cx="5731510" cy="384175"/>
+                    </a:xfrm>
+                    <a:prstGeom prst="rect">
+                      <a:avLst/>
+                    </a:prstGeom>
+                  </pic:spPr>
+                </pic:pic>
+              </a:graphicData>
+            </a:graphic>
+            <wp14:sizeRelH relativeFrom="page">
+              <wp14:pctWidth>0</wp14:pctWidth>
+            </wp14:sizeRelH>
+            <wp14:sizeRelV relativeFrom="page">
+              <wp14:pctHeight>0</wp14:pctHeight>
+            </wp14:sizeRelV>
+          </wp:anchor>
+        </w:drawing>
+      </w:r>
+      <w:r>
+        <w:rPr>
+          <w:rFonts w:ascii="SF Pro" w:hAnsi="SF Pro"/>
+          <w:noProof/>
+          <w:lang w:val="en-US"/>
+        </w:rPr>
+        <w:drawing>
+          <wp:anchor distT="0" distB="0" distL="114300" distR="114300" simplePos="0" relativeHeight="251661312" behindDoc="0" locked="0" layoutInCell="1" allowOverlap="1" wp14:anchorId="3AEC645A" wp14:editId="1979F84E">
+            <wp:simplePos x="0" y="0"/>
+            <wp:positionH relativeFrom="column">
+              <wp:posOffset>0</wp:posOffset>
+            </wp:positionH>
+            <wp:positionV relativeFrom="paragraph">
+              <wp:posOffset>492718</wp:posOffset>
+            </wp:positionV>
+            <wp:extent cx="5731510" cy="421005"/>
+            <wp:effectExtent l="0" t="0" r="0" b="0"/>
+            <wp:wrapTopAndBottom/>
+            <wp:docPr id="1341740537" name="Picture 4"/>
+            <wp:cNvGraphicFramePr>
+              <a:graphicFrameLocks xmlns:a="http://schemas.openxmlformats.org/drawingml/2006/main" noChangeAspect="1"/>
+            </wp:cNvGraphicFramePr>
+            <a:graphic xmlns:a="http://schemas.openxmlformats.org/drawingml/2006/main">
+              <a:graphicData uri="http://schemas.openxmlformats.org/drawingml/2006/picture">
+                <pic:pic xmlns:pic="http://schemas.openxmlformats.org/drawingml/2006/picture">
+                  <pic:nvPicPr>
+                    <pic:cNvPr id="1341740537" name="Picture 1341740537"/>
+                    <pic:cNvPicPr/>
+                  </pic:nvPicPr>
+                  <pic:blipFill>
+                    <a:blip r:embed="rId9" cstate="print">
+                      <a:extLst>
+                        <a:ext uri="{28A0092B-C50C-407E-A947-70E740481C1C}">
+                          <a14:useLocalDpi xmlns:a14="http://schemas.microsoft.com/office/drawing/2010/main" val="0"/>
+                        </a:ext>
+                      </a:extLst>
+                    </a:blip>
+                    <a:stretch>
+                      <a:fillRect/>
+                    </a:stretch>
+                  </pic:blipFill>
+                  <pic:spPr>
+                    <a:xfrm>
+                      <a:off x="0" y="0"/>
+                      <a:ext cx="5731510" cy="421005"/>
+                    </a:xfrm>
+                    <a:prstGeom prst="rect">
+                      <a:avLst/>
+                    </a:prstGeom>
+                  </pic:spPr>
+                </pic:pic>
+              </a:graphicData>
+            </a:graphic>
+            <wp14:sizeRelH relativeFrom="page">
+              <wp14:pctWidth>0</wp14:pctWidth>
+            </wp14:sizeRelH>
+            <wp14:sizeRelV relativeFrom="page">
+              <wp14:pctHeight>0</wp14:pctHeight>
+            </wp14:sizeRelV>
+          </wp:anchor>
+        </w:drawing>
+      </w:r>
+      <w:r>
+        <w:rPr>
+          <w:rFonts w:ascii="SF Pro" w:hAnsi="SF Pro"/>
+          <w:lang w:val="en-US"/>
+        </w:rPr>
+        <w:t>tree-d4 –</w:t>
+      </w:r>
+    </w:p>
+    <w:p>
+      <w:pPr>
+        <w:rPr>
+          <w:rFonts w:ascii="SF Pro" w:hAnsi="SF Pro"/>
+          <w:lang w:val="en-US"/>
+        </w:rPr>
+      </w:pPr>
+      <w:r>
+        <w:rPr>
+          <w:rFonts w:ascii="SF Pro" w:hAnsi="SF Pro"/>
+          <w:lang w:val="en-US"/>
+        </w:rPr>
+        <w:t>tree-d6 –</w:t>
+      </w:r>
+    </w:p>
+    <w:p>
+      <w:pPr>
+        <w:rPr>
+          <w:rFonts w:ascii="SF Pro" w:hAnsi="SF Pro"/>
+          <w:lang w:val="en-US"/>
+        </w:rPr>
+      </w:pPr>
+    </w:p>
+    <w:p>
+      <w:pPr>
+        <w:rPr>
+          <w:rFonts w:ascii="SF Pro" w:hAnsi="SF Pro"/>
+          <w:lang w:val="en-US"/>
+        </w:rPr>
+      </w:pPr>
+      <w:r>
+        <w:rPr>
+          <w:rFonts w:ascii="SF Pro" w:hAnsi="SF Pro"/>
+          <w:noProof/>
+          <w:lang w:val="en-US"/>
+        </w:rPr>
+        <w:drawing>
+          <wp:anchor distT="0" distB="0" distL="114300" distR="114300" simplePos="0" relativeHeight="251663360" behindDoc="0" locked="0" layoutInCell="1" allowOverlap="1" wp14:anchorId="61067D33" wp14:editId="3D353438">
+            <wp:simplePos x="0" y="0"/>
+            <wp:positionH relativeFrom="column">
+              <wp:posOffset>1045028</wp:posOffset>
+            </wp:positionH>
+            <wp:positionV relativeFrom="paragraph">
+              <wp:posOffset>248885</wp:posOffset>
+            </wp:positionV>
+            <wp:extent cx="3637280" cy="2491740"/>
+            <wp:effectExtent l="0" t="0" r="0" b="0"/>
+            <wp:wrapTopAndBottom/>
+            <wp:docPr id="781871801" name="Picture 6"/>
+            <wp:cNvGraphicFramePr>
+              <a:graphicFrameLocks xmlns:a="http://schemas.openxmlformats.org/drawingml/2006/main" noChangeAspect="1"/>
+            </wp:cNvGraphicFramePr>
+            <a:graphic xmlns:a="http://schemas.openxmlformats.org/drawingml/2006/main">
+              <a:graphicData uri="http://schemas.openxmlformats.org/drawingml/2006/picture">
+                <pic:pic xmlns:pic="http://schemas.openxmlformats.org/drawingml/2006/picture">
+                  <pic:nvPicPr>
+                    <pic:cNvPr id="781871801" name="Picture 781871801"/>
+                    <pic:cNvPicPr/>
+                  </pic:nvPicPr>
+                  <pic:blipFill>
+                    <a:blip r:embed="rId10" cstate="print">
+                      <a:extLst>
+                        <a:ext uri="{28A0092B-C50C-407E-A947-70E740481C1C}">
+                          <a14:useLocalDpi xmlns:a14="http://schemas.microsoft.com/office/drawing/2010/main" val="0"/>
+                        </a:ext>
+                      </a:extLst>
+                    </a:blip>
+                    <a:stretch>
+                      <a:fillRect/>
+                    </a:stretch>
+                  </pic:blipFill>
+                  <pic:spPr>
+                    <a:xfrm>
+                      <a:off x="0" y="0"/>
+                      <a:ext cx="3637280" cy="2491740"/>
+                    </a:xfrm>
+                    <a:prstGeom prst="rect">
+                      <a:avLst/>
+                    </a:prstGeom>
+                  </pic:spPr>
+                </pic:pic>
+              </a:graphicData>
+            </a:graphic>
+            <wp14:sizeRelH relativeFrom="page">
+              <wp14:pctWidth>0</wp14:pctWidth>
+            </wp14:sizeRelH>
+            <wp14:sizeRelV relativeFrom="page">
+              <wp14:pctHeight>0</wp14:pctHeight>
+            </wp14:sizeRelV>
+          </wp:anchor>
+        </w:drawing>
+      </w:r>
+      <w:r>
+        <w:rPr>
+          <w:rFonts w:ascii="SF Pro" w:hAnsi="SF Pro"/>
+          <w:b/>
+          <w:bCs/>
+          <w:lang w:val="en-US"/>
+        </w:rPr>
+        <w:t xml:space="preserve">Best Run </w:t>
+      </w:r>
+      <w:r>
+        <w:rPr>
+          <w:rFonts w:ascii="SF Pro" w:hAnsi="SF Pro"/>
+          <w:b/>
+          <w:bCs/>
+          <w:lang w:val="en-US"/>
+        </w:rPr>
+        <w:t>–</w:t>
+      </w:r>
+      <w:r>
+        <w:rPr>
+          <w:rFonts w:ascii="SF Pro" w:hAnsi="SF Pro"/>
+          <w:b/>
+          <w:bCs/>
+          <w:lang w:val="en-US"/>
+        </w:rPr>
+        <w:t xml:space="preserve"> </w:t>
+      </w:r>
+      <w:r>
+        <w:rPr>
+          <w:rFonts w:ascii="SF Pro" w:hAnsi="SF Pro"/>
+          <w:b/>
+          <w:bCs/>
+          <w:lang w:val="en-US"/>
+        </w:rPr>
+        <w:t xml:space="preserve"> </w:t>
+      </w:r>
+      <w:r>
+        <w:rPr>
+          <w:rFonts w:ascii="SF Pro" w:hAnsi="SF Pro"/>
+          <w:lang w:val="en-US"/>
+        </w:rPr>
+        <w:t>linear-baseline</w:t>
+      </w:r>
+    </w:p>
+    <w:p>
+      <w:pPr>
+        <w:rPr>
+          <w:rFonts w:ascii="SF Pro" w:hAnsi="SF Pro"/>
+          <w:b/>
+          <w:bCs/>
+          <w:lang w:val="en-US"/>
+        </w:rPr>
+      </w:pPr>
+    </w:p>
+    <w:p>
+      <w:pPr>
+        <w:rPr>
+          <w:rFonts w:ascii="SF Pro" w:hAnsi="SF Pro"/>
+          <w:b/>
+          <w:bCs/>
+          <w:lang w:val="en-US"/>
+        </w:rPr>
+      </w:pPr>
+      <w:r>
+        <w:rPr>
+          <w:rFonts w:ascii="SF Pro" w:hAnsi="SF Pro"/>
+          <w:b/>
+          <w:bCs/>
+          <w:lang w:val="en-US"/>
+        </w:rPr>
+        <w:t>Run id -</w:t>
+      </w:r>
+      <w:r>
+        <w:rPr>
+          <w:rFonts w:ascii="SF Pro" w:hAnsi="SF Pro"/>
+          <w:b/>
+          <w:bCs/>
+          <w:lang w:val="en-US"/>
+        </w:rPr>
+        <w:t xml:space="preserve"> </w:t>
+      </w:r>
+      <w:r>
+        <w:rPr>
+          <w:rFonts w:ascii="SF Pro" w:hAnsi="SF Pro"/>
+          <w:b/>
+          <w:bCs/>
+          <w:lang w:val="en-US"/>
+        </w:rPr>
+        <w:t>77736c94391842c9829d47e2b49cb91c</w:t>
+      </w:r>
+      <w:r>
+        <w:rPr>
+          <w:rFonts w:ascii="SF Pro" w:hAnsi="SF Pro"/>
+          <w:b/>
+          <w:bCs/>
+          <w:lang w:val="en-US"/>
+        </w:rPr>
+        <w:t xml:space="preserve"> </w:t>
+      </w:r>
+    </w:p>
     <w:sectPr>
       <w:pgSz w:w="11906" w:h="16838"/>
       <w:pgMar w:top="1440" w:right="1440" w:bottom="1440" w:left="1440" w:header="708" w:footer="708" w:gutter="0"/>
@@ -930,6 +1595,29 @@
       <w:spacing w:val="5"/>
     </w:rPr>
   </w:style>
+  <w:style w:type="character" w:styleId="Hyperlink">
+    <w:name w:val="Hyperlink"/>
+    <w:basedOn w:val="DefaultParagraphFont"/>
+    <w:uiPriority w:val="99"/>
+    <w:unhideWhenUsed/>
+    <w:rsid w:val="009760FD"/>
+    <w:rPr>
+      <w:color w:val="467886" w:themeColor="hyperlink"/>
+      <w:u w:val="single"/>
+    </w:rPr>
+  </w:style>
+  <w:style w:type="character" w:styleId="UnresolvedMention">
+    <w:name w:val="Unresolved Mention"/>
+    <w:basedOn w:val="DefaultParagraphFont"/>
+    <w:uiPriority w:val="99"/>
+    <w:semiHidden/>
+    <w:unhideWhenUsed/>
+    <w:rsid w:val="009760FD"/>
+    <w:rPr>
+      <w:color w:val="605E5C"/>
+      <w:shd w:val="clear" w:color="auto" w:fill="E1DFDD"/>
+    </w:rPr>
+  </w:style>
 </w:styles>
 </file>
 

</xml_diff>